<commit_message>
Add presentation dataset and demo guidance
Add a synthetic 19-event dataset, presentation guide, and VS Code tasks for running the demo and tests. Improve CLI incident output with readable UTC timestamps and event descriptions, and update the midterm report and progress documentation.
</commit_message>
<xml_diff>
--- a/docs/SOC_Alert_Correlation_Midterm_Report.docx
+++ b/docs/SOC_Alert_Correlation_Midterm_Report.docx
@@ -131,6 +131,7 @@
       <w:pPr>
         <w:pStyle w:val="Heading1"/>
         <w:keepNext/>
+        <w:spacing w:after="300"/>
       </w:pPr>
       <w:r>
         <w:t>Table of Contents</w:t>
@@ -139,15 +140,15 @@
     <w:p>
       <w:pPr>
         <w:tabs>
-          <w:tab w:pos="9576" w:val="right" w:leader="dot"/>
+          <w:tab w:pos="9360" w:val="right" w:leader="dot"/>
         </w:tabs>
-        <w:spacing w:after="60"/>
+        <w:spacing w:after="240" w:line="276" w:lineRule="auto"/>
         <w:ind w:left="0"/>
       </w:pPr>
       <w:r>
         <w:rPr>
           <w:rFonts w:ascii="Arial" w:hAnsi="Arial" w:eastAsia="Arial"/>
-          <w:sz w:val="20"/>
+          <w:sz w:val="21"/>
         </w:rPr>
         <w:t>Abstract</w:t>
         <w:tab/>
@@ -157,15 +158,15 @@
     <w:p>
       <w:pPr>
         <w:tabs>
-          <w:tab w:pos="9576" w:val="right" w:leader="dot"/>
+          <w:tab w:pos="9360" w:val="right" w:leader="dot"/>
         </w:tabs>
-        <w:spacing w:after="60"/>
+        <w:spacing w:after="240" w:line="276" w:lineRule="auto"/>
         <w:ind w:left="0"/>
       </w:pPr>
       <w:r>
         <w:rPr>
           <w:rFonts w:ascii="Arial" w:hAnsi="Arial" w:eastAsia="Arial"/>
-          <w:sz w:val="20"/>
+          <w:sz w:val="21"/>
         </w:rPr>
         <w:t>1 Problem Definition</w:t>
         <w:tab/>
@@ -175,15 +176,15 @@
     <w:p>
       <w:pPr>
         <w:tabs>
-          <w:tab w:pos="9576" w:val="right" w:leader="dot"/>
+          <w:tab w:pos="9360" w:val="right" w:leader="dot"/>
         </w:tabs>
-        <w:spacing w:after="60"/>
+        <w:spacing w:after="240" w:line="276" w:lineRule="auto"/>
         <w:ind w:left="0"/>
       </w:pPr>
       <w:r>
         <w:rPr>
           <w:rFonts w:ascii="Arial" w:hAnsi="Arial" w:eastAsia="Arial"/>
-          <w:sz w:val="20"/>
+          <w:sz w:val="21"/>
         </w:rPr>
         <w:t>2 Project Objectives and Scope</w:t>
         <w:tab/>
@@ -193,15 +194,15 @@
     <w:p>
       <w:pPr>
         <w:tabs>
-          <w:tab w:pos="9576" w:val="right" w:leader="dot"/>
+          <w:tab w:pos="9360" w:val="right" w:leader="dot"/>
         </w:tabs>
-        <w:spacing w:after="60"/>
+        <w:spacing w:after="240" w:line="276" w:lineRule="auto"/>
         <w:ind w:left="0"/>
       </w:pPr>
       <w:r>
         <w:rPr>
           <w:rFonts w:ascii="Arial" w:hAnsi="Arial" w:eastAsia="Arial"/>
-          <w:sz w:val="20"/>
+          <w:sz w:val="21"/>
         </w:rPr>
         <w:t>3 System Architecture</w:t>
         <w:tab/>
@@ -211,15 +212,15 @@
     <w:p>
       <w:pPr>
         <w:tabs>
-          <w:tab w:pos="9576" w:val="right" w:leader="dot"/>
+          <w:tab w:pos="9360" w:val="right" w:leader="dot"/>
         </w:tabs>
-        <w:spacing w:after="60"/>
+        <w:spacing w:after="240" w:line="276" w:lineRule="auto"/>
         <w:ind w:left="0"/>
       </w:pPr>
       <w:r>
         <w:rPr>
           <w:rFonts w:ascii="Arial" w:hAnsi="Arial" w:eastAsia="Arial"/>
-          <w:sz w:val="20"/>
+          <w:sz w:val="21"/>
         </w:rPr>
         <w:t>4 Module Design</w:t>
         <w:tab/>
@@ -229,15 +230,15 @@
     <w:p>
       <w:pPr>
         <w:tabs>
-          <w:tab w:pos="9576" w:val="right" w:leader="dot"/>
+          <w:tab w:pos="9360" w:val="right" w:leader="dot"/>
         </w:tabs>
-        <w:spacing w:after="60"/>
+        <w:spacing w:after="240" w:line="276" w:lineRule="auto"/>
         <w:ind w:left="0"/>
       </w:pPr>
       <w:r>
         <w:rPr>
           <w:rFonts w:ascii="Arial" w:hAnsi="Arial" w:eastAsia="Arial"/>
-          <w:sz w:val="20"/>
+          <w:sz w:val="21"/>
         </w:rPr>
         <w:t>5 Data Structures and Algorithms</w:t>
         <w:tab/>
@@ -247,15 +248,15 @@
     <w:p>
       <w:pPr>
         <w:tabs>
-          <w:tab w:pos="9576" w:val="right" w:leader="dot"/>
+          <w:tab w:pos="9360" w:val="right" w:leader="dot"/>
         </w:tabs>
-        <w:spacing w:after="60"/>
+        <w:spacing w:after="240" w:line="276" w:lineRule="auto"/>
         <w:ind w:left="0"/>
       </w:pPr>
       <w:r>
         <w:rPr>
           <w:rFonts w:ascii="Arial" w:hAnsi="Arial" w:eastAsia="Arial"/>
-          <w:sz w:val="20"/>
+          <w:sz w:val="21"/>
         </w:rPr>
         <w:t>6 Event Ingestion and Validation</w:t>
         <w:tab/>
@@ -265,15 +266,15 @@
     <w:p>
       <w:pPr>
         <w:tabs>
-          <w:tab w:pos="9576" w:val="right" w:leader="dot"/>
+          <w:tab w:pos="9360" w:val="right" w:leader="dot"/>
         </w:tabs>
-        <w:spacing w:after="60"/>
+        <w:spacing w:after="240" w:line="276" w:lineRule="auto"/>
         <w:ind w:left="0"/>
       </w:pPr>
       <w:r>
         <w:rPr>
           <w:rFonts w:ascii="Arial" w:hAnsi="Arial" w:eastAsia="Arial"/>
-          <w:sz w:val="20"/>
+          <w:sz w:val="21"/>
         </w:rPr>
         <w:t>7 Correlation Method</w:t>
         <w:tab/>
@@ -283,15 +284,15 @@
     <w:p>
       <w:pPr>
         <w:tabs>
-          <w:tab w:pos="9576" w:val="right" w:leader="dot"/>
+          <w:tab w:pos="9360" w:val="right" w:leader="dot"/>
         </w:tabs>
-        <w:spacing w:after="60"/>
+        <w:spacing w:after="240" w:line="276" w:lineRule="auto"/>
         <w:ind w:left="0"/>
       </w:pPr>
       <w:r>
         <w:rPr>
           <w:rFonts w:ascii="Arial" w:hAnsi="Arial" w:eastAsia="Arial"/>
-          <w:sz w:val="20"/>
+          <w:sz w:val="21"/>
         </w:rPr>
         <w:t>8 Incident Scoring and Prioritization</w:t>
         <w:tab/>
@@ -301,15 +302,15 @@
     <w:p>
       <w:pPr>
         <w:tabs>
-          <w:tab w:pos="9576" w:val="right" w:leader="dot"/>
+          <w:tab w:pos="9360" w:val="right" w:leader="dot"/>
         </w:tabs>
-        <w:spacing w:after="60"/>
+        <w:spacing w:after="240" w:line="276" w:lineRule="auto"/>
         <w:ind w:left="0"/>
       </w:pPr>
       <w:r>
         <w:rPr>
           <w:rFonts w:ascii="Arial" w:hAnsi="Arial" w:eastAsia="Arial"/>
-          <w:sz w:val="20"/>
+          <w:sz w:val="21"/>
         </w:rPr>
         <w:t>9 Synthetic Dataset</w:t>
         <w:tab/>
@@ -319,15 +320,15 @@
     <w:p>
       <w:pPr>
         <w:tabs>
-          <w:tab w:pos="9576" w:val="right" w:leader="dot"/>
+          <w:tab w:pos="9360" w:val="right" w:leader="dot"/>
         </w:tabs>
-        <w:spacing w:after="60"/>
+        <w:spacing w:after="240" w:line="276" w:lineRule="auto"/>
         <w:ind w:left="0"/>
       </w:pPr>
       <w:r>
         <w:rPr>
           <w:rFonts w:ascii="Arial" w:hAnsi="Arial" w:eastAsia="Arial"/>
-          <w:sz w:val="20"/>
+          <w:sz w:val="21"/>
         </w:rPr>
         <w:t>10 Testing and Verification</w:t>
         <w:tab/>
@@ -337,15 +338,15 @@
     <w:p>
       <w:pPr>
         <w:tabs>
-          <w:tab w:pos="9576" w:val="right" w:leader="dot"/>
+          <w:tab w:pos="9360" w:val="right" w:leader="dot"/>
         </w:tabs>
-        <w:spacing w:after="60"/>
+        <w:spacing w:after="240" w:line="276" w:lineRule="auto"/>
         <w:ind w:left="0"/>
       </w:pPr>
       <w:r>
         <w:rPr>
           <w:rFonts w:ascii="Arial" w:hAnsi="Arial" w:eastAsia="Arial"/>
-          <w:sz w:val="20"/>
+          <w:sz w:val="21"/>
         </w:rPr>
         <w:t>11 Demonstration Results</w:t>
         <w:tab/>
@@ -355,15 +356,15 @@
     <w:p>
       <w:pPr>
         <w:tabs>
-          <w:tab w:pos="9576" w:val="right" w:leader="dot"/>
+          <w:tab w:pos="9360" w:val="right" w:leader="dot"/>
         </w:tabs>
-        <w:spacing w:after="60"/>
+        <w:spacing w:after="240" w:line="276" w:lineRule="auto"/>
         <w:ind w:left="0"/>
       </w:pPr>
       <w:r>
         <w:rPr>
           <w:rFonts w:ascii="Arial" w:hAnsi="Arial" w:eastAsia="Arial"/>
-          <w:sz w:val="20"/>
+          <w:sz w:val="21"/>
         </w:rPr>
         <w:t>12 Complexity Analysis</w:t>
         <w:tab/>
@@ -373,15 +374,15 @@
     <w:p>
       <w:pPr>
         <w:tabs>
-          <w:tab w:pos="9576" w:val="right" w:leader="dot"/>
+          <w:tab w:pos="9360" w:val="right" w:leader="dot"/>
         </w:tabs>
-        <w:spacing w:after="60"/>
+        <w:spacing w:after="240" w:line="276" w:lineRule="auto"/>
         <w:ind w:left="0"/>
       </w:pPr>
       <w:r>
         <w:rPr>
           <w:rFonts w:ascii="Arial" w:hAnsi="Arial" w:eastAsia="Arial"/>
-          <w:sz w:val="20"/>
+          <w:sz w:val="21"/>
         </w:rPr>
         <w:t>13 Current Limitations</w:t>
         <w:tab/>
@@ -391,15 +392,15 @@
     <w:p>
       <w:pPr>
         <w:tabs>
-          <w:tab w:pos="9576" w:val="right" w:leader="dot"/>
+          <w:tab w:pos="9360" w:val="right" w:leader="dot"/>
         </w:tabs>
-        <w:spacing w:after="60"/>
+        <w:spacing w:after="240" w:line="276" w:lineRule="auto"/>
         <w:ind w:left="0"/>
       </w:pPr>
       <w:r>
         <w:rPr>
           <w:rFonts w:ascii="Arial" w:hAnsi="Arial" w:eastAsia="Arial"/>
-          <w:sz w:val="20"/>
+          <w:sz w:val="21"/>
         </w:rPr>
         <w:t>14 Planned Work</w:t>
         <w:tab/>
@@ -409,15 +410,15 @@
     <w:p>
       <w:pPr>
         <w:tabs>
-          <w:tab w:pos="9576" w:val="right" w:leader="dot"/>
+          <w:tab w:pos="9360" w:val="right" w:leader="dot"/>
         </w:tabs>
-        <w:spacing w:after="60"/>
+        <w:spacing w:after="240" w:line="276" w:lineRule="auto"/>
         <w:ind w:left="0"/>
       </w:pPr>
       <w:r>
         <w:rPr>
           <w:rFonts w:ascii="Arial" w:hAnsi="Arial" w:eastAsia="Arial"/>
-          <w:sz w:val="20"/>
+          <w:sz w:val="21"/>
         </w:rPr>
         <w:t>15 Conclusion</w:t>
         <w:tab/>
@@ -427,15 +428,15 @@
     <w:p>
       <w:pPr>
         <w:tabs>
-          <w:tab w:pos="9576" w:val="right" w:leader="dot"/>
+          <w:tab w:pos="9360" w:val="right" w:leader="dot"/>
         </w:tabs>
-        <w:spacing w:after="60"/>
+        <w:spacing w:after="240" w:line="276" w:lineRule="auto"/>
         <w:ind w:left="0"/>
       </w:pPr>
       <w:r>
         <w:rPr>
           <w:rFonts w:ascii="Arial" w:hAnsi="Arial" w:eastAsia="Arial"/>
-          <w:sz w:val="20"/>
+          <w:sz w:val="21"/>
         </w:rPr>
         <w:t>Appendix A Repository and Execution</w:t>
         <w:tab/>
@@ -445,15 +446,15 @@
     <w:p>
       <w:pPr>
         <w:tabs>
-          <w:tab w:pos="9576" w:val="right" w:leader="dot"/>
+          <w:tab w:pos="9360" w:val="right" w:leader="dot"/>
         </w:tabs>
-        <w:spacing w:after="60"/>
+        <w:spacing w:after="240" w:line="276" w:lineRule="auto"/>
         <w:ind w:left="0"/>
       </w:pPr>
       <w:r>
         <w:rPr>
           <w:rFonts w:ascii="Arial" w:hAnsi="Arial" w:eastAsia="Arial"/>
-          <w:sz w:val="20"/>
+          <w:sz w:val="21"/>
         </w:rPr>
         <w:t>Appendix B Verified Test Summary</w:t>
         <w:tab/>

</xml_diff>